<commit_message>
Prayer guide 2026-10-09: 15 points
Co-Authored-By: Claude Sonnet 5.5 <noreply@anthropic.com>
Claude-Session: https://claude.ai/code/session_01RoHttewa4bix1UWRwUX75E
</commit_message>
<xml_diff>
--- a/prayer/2026-10-09.docx
+++ b/prayer/2026-10-09.docx
@@ -183,7 +183,7 @@
           <w:b/>
           <w:bCs/>
         </w:rPr>
-        <w:t xml:space="preserve">Peace of mind for the grieving and fearful after the anniversary</w:t>
+        <w:t xml:space="preserve">The grieving soldiers' families, and Jewish communities shaken by hatred</w:t>
       </w:r>
       <w:r>
         <w:t xml:space="preserve"> — Philippians 4:6-7</w:t>
@@ -734,7 +734,7 @@
         <w:pStyle w:val="Heading2"/>
       </w:pPr>
       <w:r>
-        <w:t xml:space="preserve">5. Peace of mind for the grieving and fearful after the anniversary</w:t>
+        <w:t xml:space="preserve">5. The grieving soldiers' families, and Jewish communities shaken by hatred</w:t>
       </w:r>
     </w:p>
     <w:p>
@@ -748,23 +748,23 @@
         </w:rPr>
         <w:t xml:space="preserve">In the news: </w:t>
       </w:r>
-      <w:hyperlink r:id="rIdL4" w:history="1">
+      <w:hyperlink r:id="rIdL7" w:history="1">
         <w:r>
           <w:rPr>
             <w:rStyle w:val="Hyperlink"/>
           </w:rPr>
-          <w:t xml:space="preserve">Former military secretary alleges Netanyahu's chief of staff tampered with 7 October phone records</w:t>
+          <w:t xml:space="preserve">IDF officer killed in southern Lebanon; Hamas commander who held hostages reported killed in Gaza City</w:t>
         </w:r>
       </w:hyperlink>
       <w:r>
         <w:t xml:space="preserve">; </w:t>
       </w:r>
-      <w:hyperlink r:id="rIdL5" w:history="1">
+      <w:hyperlink r:id="rIdL8" w:history="1">
         <w:r>
           <w:rPr>
             <w:rStyle w:val="Hyperlink"/>
           </w:rPr>
-          <w:t xml:space="preserve">Qatari negotiators travel to Tehran to try to finalise a US–Iran deal</w:t>
+          <w:t xml:space="preserve">Jewish groups in Canada cite antisemitic incidents on 7 October anniversary</w:t>
         </w:r>
       </w:hyperlink>
     </w:p>
@@ -818,7 +818,7 @@
         <w:t xml:space="preserve">Prayer: </w:t>
       </w:r>
       <w:r>
-        <w:t xml:space="preserve">Lord Jesus, I thank You for the memorials held this week and I bring You the families who carry grief, anxiety and fear in Israel and in Jewish communities abroad. Teach them to be careful for nothing and to make their requests known to You with thanksgiving. Let Your peace, which passes all understanding, guard their hearts and minds. Be near the bereaved, the wounded, the soldiers who still carry what they saw, and the parents who are afraid for their children. Where threats are warned of, protect them. Where sleep is hard, give rest. Amen.</w:t>
+        <w:t xml:space="preserve">Lord Jesus, I bring You the family of Captain Eliav Haim Tzapalamus, killed in southern Lebanon, and the three soldiers who were wounded. Be near to those who mourn, and let Your peace, which passes all understanding, guard their hearts and minds. I also pray for Jewish families in Canada and elsewhere who woke to burning flags and rising hatred on the anniversary of 7 October. Take away their fear, protect their synagogues and homes, and give the authorities wisdom and diligence. Lord, I do not carry these burdens alone; I lay them in Your hands with thanksgiving, trusting that You hear. Amen.</w:t>
       </w:r>
     </w:p>
     <w:p>

</xml_diff>